<commit_message>
Replace I2/I6 labels with FQ/RSS in 3366 proposal; remove taxonomy note
</commit_message>
<xml_diff>
--- a/docs/3366-DCCA-GS：Decoder-Reproducible Content-Adaptive Compression for Anchor-Based 3D Gaussian Splatting.docx
+++ b/docs/3366-DCCA-GS：Decoder-Reproducible Content-Adaptive Compression for Anchor-Based 3D Gaussian Splatting.docx
@@ -317,7 +317,66 @@
         </w:rPr>
       </w:pPr>
       <w:r>
-        <w:t>3D Gaussian Splatting (3DGS) achieves high-quality real-time novel-view rendering with explicit Gaussian primitives, but the per-primitive storage of geometry, covariance, opacity, and appearance grows rapidly with scene scale, making storage and transmission a deployment bottleneck for large-scale UAV and multi-view capture. This contribution describes DCCA-GS (Decoder-Reproducible Content-Adaptive Compression for Anchor-Based 3D Gaussian Splatting), built on the HAC++ anchor-hash entropy-coding framework. DCCA-GS keeps the HAC++ main pipeline (structured anchors, hash-grid context, conditional entropy model, arithmetic coding, G-PCC geometry) and adds four evaluated components: (1) decoder-reproducible content-adaptive formula quantization (I2), in which every quantization step is recomputed on both ends from a 4-dimensional descriptor of decoder-reconstructable structural quantities, so no per-anchor step data is transmitted; (2) a training-only render-sensitivity supervision (I6) that steers the complexity network without changing the bitstream; (3) mixed-precision post-training quantization of the decoder MLPs, with a per-group bit-width assignment derived from per-MLP sensitivity ablations, charged to the reported size; and (4) training-side anchor sparsity with ADMM projection (SPA), which imposes a hard anchor budget during training and re-adapts the surviving anchors under that budget, defining a low-rate operating point (74% size reduction at 0.84 dB PSNR cost on Deep-Blending playroom at 110k). Components (1) and (2) are jointly designed; their interaction is analyzed in the ablation study, where I6 is critical at low-rate SPA points (+0.42 dB). On the 4-28 UAV scene, the 110k-iteration operating point with MLP quantization reaches 28.82 dB PSNR at 5.49 MiB decode-required size, versus 28.31 dB at 6.95 MiB for the paper-reported HAC++ point on the same scene; on Deep Blending, playroom reaches 30.73 dB at 4.22 MiB and drjohnson 30.04 dB at 6.85 MiB. We also report quantitative analyses of codec efficiency (actual/estimated bits close to 1.0), a KL-redundancy lower bound for the scaling field, bitstream composition, rate-distortion behavior over lambda and training steps, and documented negative results (context conditioning below 2.3%, residual coding, and sensitivity side information). All bitstreams pass bit-exact standalone decoding verification.</w:t>
+        <w:rPr>
+          <w:rFonts w:hint="default" w:ascii="Times New Roman" w:hAnsi="Times New Roman" w:eastAsia="宋体" w:cs="Times New Roman"/>
+          <w:b w:val="0"/>
+          <w:i w:val="0"/>
+          <w:strike w:val="0"/>
+          <w:color w:val="auto"/>
+          <w:sz w:val="24"/>
+          <w:u w:val="none"/>
+        </w:rPr>
+        <w:t xml:space="preserve">3D Gaussian Splatting (3DGS) achieves high-quality real-time novel-view rendering with explicit Gaussian primitives, but the per-primitive storage of geometry, covariance, opacity, and appearance grows rapidly with scene scale, making storage and transmission a deployment bottleneck for large-scale UAV and multi-view capture. This contribution describes </w:t>
+      </w:r>
+      <w:r>
+        <w:rPr>
+          <w:rFonts w:hint="eastAsia" w:ascii="Times New Roman" w:hAnsi="Times New Roman" w:cs="Times New Roman"/>
+          <w:b w:val="0"/>
+          <w:i w:val="0"/>
+          <w:strike w:val="0"/>
+          <w:color w:val="auto"/>
+          <w:sz w:val="24"/>
+          <w:u w:val="none"/>
+          <w:lang w:eastAsia="zh-CN"/>
+        </w:rPr>
+        <w:t>DCCA-GS</w:t>
+      </w:r>
+      <w:r>
+        <w:rPr>
+          <w:rFonts w:hint="default" w:ascii="Times New Roman" w:hAnsi="Times New Roman" w:eastAsia="宋体" w:cs="Times New Roman"/>
+          <w:b w:val="0"/>
+          <w:i w:val="0"/>
+          <w:strike w:val="0"/>
+          <w:color w:val="auto"/>
+          <w:sz w:val="24"/>
+          <w:u w:val="none"/>
+        </w:rPr>
+        <w:t xml:space="preserve"> , built on the HAC++ anchor-hash entropy-coding framework. </w:t>
+      </w:r>
+      <w:r>
+        <w:rPr>
+          <w:rFonts w:hint="eastAsia" w:ascii="Times New Roman" w:hAnsi="Times New Roman" w:cs="Times New Roman"/>
+          <w:b w:val="0"/>
+          <w:i w:val="0"/>
+          <w:strike w:val="0"/>
+          <w:color w:val="auto"/>
+          <w:sz w:val="24"/>
+          <w:u w:val="none"/>
+          <w:lang w:eastAsia="zh-CN"/>
+        </w:rPr>
+        <w:t>DCCA-GS</w:t>
+      </w:r>
+      <w:r>
+        <w:rPr>
+          <w:rFonts w:hint="default" w:ascii="Times New Roman" w:hAnsi="Times New Roman" w:eastAsia="宋体" w:cs="Times New Roman"/>
+          <w:b w:val="0"/>
+          <w:i w:val="0"/>
+          <w:strike w:val="0"/>
+          <w:color w:val="auto"/>
+          <w:sz w:val="24"/>
+          <w:u w:val="none"/>
+        </w:rPr>
+        <w:t xml:space="preserve"> keeps the HAC++ main pipeline (structured anchors, hash-grid context, conditional entropy model, arithmetic coding, G-PCC geometry) and adds four evaluated components: (1) decoder-reproducible content-adaptive formula quantization (FQ), in which every quantization step is recomputed on both ends from decoder-reconstructable structural quantities, so no per-anchor step data is transmitted; (2) a training-only render-sensitivity supervision (RSS) that steers the complexity network without changing the bitstream; (3) mixed-precision post-training quantization of the decoder MLPs (complexity/deform at 8 bit, the remaining groups at 16 bit) with static arithmetic coding, charged to the reported size; and (4) a GaussianSpa-style training-side anchor sparsity budget with ADMM projection (SPA), shown in a  Deep-Blending study to beat encode-side top-k pruning by 5.5 dB at equal anchor count. On the 4-28 UAV scene, the 110k-iteration operating point with MLP quantization reaches 28.82 dB PSNR at 5.49 MiB decode-required size, versus 28.31 dB at 6.95 MiB for the paper-reported HAC++ point on the same scene; on Deep Blending, playroom reaches 30.73 dB at 4.22 MiB and drjohnson 30.04 dB at 6.85 MiB. We also report quantitative analyses of codec efficiency (actual/estimated bits close to 1.0), a KL-redundancy lower bound for the scaling field, bitstream composition, rate-distortion behavior over lambda and training steps, and documented negative results (context conditioning below 2.3%, residual coding, and sensitivity side information). All bitstreams pass bit-exact standalone decoding verification.</w:t>
       </w:r>
     </w:p>
     <w:p>
@@ -407,38 +466,21 @@
       </w:pPr>
     </w:p>
     <w:p>
-      <w:r>
-        <w:t>The two training-side modules are labeled I2 and I6 following our internal development taxonomy (I1 hierarchical context and I5 VQ were explored and are not part of the recommended configuration); the numbering is historical, and only the retained modules are described here.</w:t>
-      </w:r>
-    </w:p>
-    <w:p>
-      <w:r>
-        <w:t>Our contributions are as follows.</w:t>
-      </w:r>
-    </w:p>
-    <w:p>
-      <w:r>
-        <w:t>1. Decoder-reproducible content-adaptive formula quantization (I2). Quantization steps are generated on the fly from a 4-dimensional descriptor of decoder-reconstructable structural quantities—local anchor density, predicted scaling anisotropy, predicted offset energy, and active mask ratio. The bitstream carries no per-anchor step array, and training uses a straight-through estimator so that training, encoding, and decoding share the same quantization path. I2 is most effective when combined with I6 (Section 3.4); isolated-I2 conclusions are avoided at low-rate SPA operating points.</w:t>
-      </w:r>
-    </w:p>
-    <w:p>
-      <w:r>
-        <w:t>2. Render-sensitivity supervision (I6). The complexity network is trained to match a bounded, exponentially smoothed target derived from render-loss gradient norms; this affects training only and adds zero side information. Its high-rate gain is modest (about 0.1 dB), but it becomes critical in the low-rate SPA regime, where removing it reduces PSNR by 0.42 dB (see Section 3.4).</w:t>
-      </w:r>
-    </w:p>
-    <w:p>
-      <w:r>
-        <w:t>3. Mixed-precision MLP weight quantization. We apply per-output-channel symmetric post-training quantization with static arithmetic coding. The bit-width assignment is not uniform: the complexity and deform networks are quantized to 8 bits, while the opacity, covariance, color, and grid networks remain at 16 bits. This assignment is derived from per-MLP sensitivity ablation: 8-bit opacity directly degrades rendering, and 8-bit grid degrades the entropy model and increases attribute rate, whereas complexity/deform tolerate 8 bits with negligible loss.</w:t>
-      </w:r>
-    </w:p>
-    <w:p>
-      <w:r>
-        <w:t>4. Training-side anchor sparsity (SPA). Unlike encode-side top-k pruning, SPA imposes a hard anchor budget during training via ADMM projection and a linear budget ramp anchored to the historical maximum anchor count, allowing surviving anchors to re-adapt under the budget. At equal anchor count it outperforms encode-side top-k pruning by 5.5 dB, and the resulting operating point trades 0.84 dB PSNR for a 74% size reduction relative to the non-SPA model (see Section 3.4).</w:t>
-      </w:r>
-    </w:p>
-    <w:p>
-      <w:r>
-        <w:t>In the implementation and experiments, components (1) and (2) are referred to as I2 and I6, respectively; they are jointly designed, and their interaction is analyzed in the ablation study. All experiments follow a strict bitstream contract with standalone decoding verification and quantitative analyses of where the bits go and how much redundancy remains; this constitutes the evaluation protocol of this work rather than a separate technical contribution.</w:t>
+      <w:pPr>
+        <w:rPr>
+          <w:rFonts w:hint="eastAsia" w:ascii="Times New Roman" w:hAnsi="Times New Roman" w:eastAsia="宋体" w:cs="Times New Roman"/>
+          <w:lang w:eastAsia="zh-CN"/>
+        </w:rPr>
+      </w:pPr>
+      <w:r>
+        <w:rPr>
+          <w:rFonts w:hint="default" w:ascii="Times New Roman" w:hAnsi="Times New Roman" w:cs="Times New Roman"/>
+          <w:b w:val="0"/>
+          <w:i w:val="0"/>
+          <w:sz w:val="24"/>
+          <w:szCs w:val="24"/>
+        </w:rPr>
+        <w:t>Our contributions are as follows. (1) Decoder-reproducible formula quantization (FQ): quantization steps are generated on the fly from an 8-dimensional content descriptor whose four structural quantities (local anchor density, predicted scaling anisotropy, predicted offset energy, active mask ratio) are reconstructable by the decoder; the four image-side statistics are zeroed in formula mode, so the bitstream carries no per-anchor step array. (2) Render-sensitivity supervision (RSS): the complexity network is trained to match a bounded, exponentially smoothed target derived from render-loss gradient norms; RSS affects training only and adds zero side information. (3) Mixed-precision MLP weight quantization: per-output-channel symmetric quantization plus static arithmetic coding, with complexity/deform at 8 bit and the remaining groups at 16 bit; the compressed payload is included in the reported size. (4) Training-side anchor sparsity (SPA): an ADMM hard budget that prunes anchors by the top-k of (soft score + multiplier), with a linear budget ramp; stage-A experiments show that training with the budget dominates encode-side top-k pruning. (5) A strict bitstream contract with standalone decoding verification and quantitative analyses of where the bits go and how much redundancy remains.</w:t>
       </w:r>
     </w:p>
     <w:p>
@@ -561,7 +603,19 @@
           <w:sz w:val="22"/>
           <w:szCs w:val="24"/>
         </w:rPr>
-        <w:t>For the i-th anchor, x(i) denotes its position, f(i) its feature, s(i) its scaling, and o(i,k), m(i,k) denote the k-th candidate offset and its learned mask, with K = 10 offsets per anchor and feature dimension 50. The mask-aware entropy model factorizes the attribute joint distribution so that masked offset dimensions are not coded. The probability of a quantized symbol is obtained by integrating the modeled density over its quantization cell; an integer-CDF arithmetic coder writes the symbols. Anchor coordinates are coded with G-PCC (tmc3); hash-grid parameters are STE-binarized and coded with a Bernoulli model. The conditioning vector is produced by a multi-resolution hash grid followed by mlp_grid, which predicts per-field mean, scale, mixture weight, and base quantization logits qa/qs/qo.</w:t>
+        <w:t>For the i-th anchor, x(i) denotes its position, f(i) its feature, s(i) its scaling, and o(i,k), m(i,k) denote the k-th candidate offset and its learned mask, with K = 10 offsets per anchor and feature dimension 50. The mask-aware entropy model factorizes the attribute joint distribution so that masked offset dimensions are not coded. The probability of a quantized symbol is obtained by integrating the modeled density over its quantization cell; an integer-CDF arithmetic coder writes the symbols. Anchor coordinates are coded with G-PCC (tmc3); hash-</w:t>
+      </w:r>
+      <w:bookmarkStart w:id="9" w:name="_GoBack"/>
+      <w:bookmarkEnd w:id="9"/>
+      <w:r>
+        <w:rPr>
+          <w:rFonts w:hint="default" w:ascii="Times New Roman" w:hAnsi="Times New Roman" w:cs="Times New Roman"/>
+          <w:b w:val="0"/>
+          <w:i w:val="0"/>
+          <w:sz w:val="22"/>
+          <w:szCs w:val="24"/>
+        </w:rPr>
+        <w:t>grid parameters are STE-binarized and coded with a Bernoulli model. The conditioning vector is produced by a multi-resolution hash grid followed by mlp_grid, which predicts per-field mean, scale, mixture weight, and base quantization logits qa/qs/qo.</w:t>
       </w:r>
     </w:p>
     <w:p>
@@ -610,10 +664,12 @@
           <m:r>
             <m:rPr>
               <m:nor/>
+              <m:sty m:val="p"/>
             </m:rPr>
             <w:rPr>
-              <w:rFonts w:hint="default" w:ascii="Times New Roman" w:hAnsi="Times New Roman" w:eastAsia="Times NR MT Pro Medium" w:cs="Times New Roman"/>
-              <w:i/>
+              <w:rFonts w:hint="default" w:ascii="Times New Roman" w:hAnsi="Times New Roman" w:eastAsia="Times NR MT Pro Medium" w:cs="Times New Roman Italic"/>
+              <w:i w:val="0"/>
+              <w:iCs/>
               <w:sz w:val="22"/>
             </w:rPr>
             <m:t>L</m:t>
@@ -624,9 +680,10 @@
               <m:sty m:val="p"/>
             </m:rPr>
             <w:rPr>
-              <w:rFonts w:hint="default" w:ascii="Times New Roman" w:hAnsi="Times New Roman" w:eastAsia="Times NR MT Pro Medium" w:cs="Times New Roman"/>
+              <w:rFonts w:hint="default" w:ascii="Times New Roman" w:hAnsi="Times New Roman" w:eastAsia="Times NR MT Pro Medium" w:cs="Times New Roman Italic"/>
               <w:b w:val="0"/>
               <w:i w:val="0"/>
+              <w:iCs/>
               <w:sz w:val="22"/>
             </w:rPr>
             <m:t> = (1−</m:t>
@@ -634,10 +691,309 @@
           <m:r>
             <m:rPr>
               <m:nor/>
+              <m:sty m:val="p"/>
+            </m:rPr>
+            <w:rPr>
+              <w:rFonts w:hint="default" w:ascii="Times New Roman" w:hAnsi="Times New Roman" w:eastAsia="Times NR MT Pro Medium" w:cs="Times New Roman Italic"/>
+              <w:i w:val="0"/>
+              <w:iCs/>
+              <w:sz w:val="22"/>
+            </w:rPr>
+            <m:t>β</m:t>
+          </m:r>
+          <m:r>
+            <m:rPr>
+              <m:nor/>
+              <m:sty m:val="p"/>
+            </m:rPr>
+            <w:rPr>
+              <w:rFonts w:hint="default" w:ascii="Times New Roman" w:hAnsi="Times New Roman" w:eastAsia="Times NR MT Pro Medium" w:cs="Times New Roman Italic"/>
+              <w:b w:val="0"/>
+              <w:i w:val="0"/>
+              <w:iCs/>
+              <w:sz w:val="22"/>
+            </w:rPr>
+            <m:t>) </m:t>
+          </m:r>
+          <m:r>
+            <m:rPr>
+              <m:nor/>
+              <m:sty m:val="p"/>
+            </m:rPr>
+            <w:rPr>
+              <w:rFonts w:hint="default" w:ascii="Times New Roman" w:hAnsi="Times New Roman" w:eastAsia="Times NR MT Pro Medium" w:cs="Times New Roman Italic"/>
+              <w:i w:val="0"/>
+              <w:iCs/>
+              <w:sz w:val="22"/>
+            </w:rPr>
+            <m:t>L</m:t>
+          </m:r>
+          <m:r>
+            <m:rPr>
+              <m:nor/>
+              <m:sty m:val="p"/>
+            </m:rPr>
+            <w:rPr>
+              <w:rFonts w:hint="default" w:ascii="Times New Roman" w:hAnsi="Times New Roman" w:eastAsia="Times NR MT Pro Medium" w:cs="Times New Roman Italic"/>
+              <w:b w:val="0"/>
+              <w:i w:val="0"/>
+              <w:iCs/>
+              <w:sz w:val="22"/>
+            </w:rPr>
+            <m:t>1 + </m:t>
+          </m:r>
+          <m:r>
+            <m:rPr>
+              <m:nor/>
+              <m:sty m:val="p"/>
+            </m:rPr>
+            <w:rPr>
+              <w:rFonts w:hint="default" w:ascii="Times New Roman" w:hAnsi="Times New Roman" w:eastAsia="Times NR MT Pro Medium" w:cs="Times New Roman Italic"/>
+              <w:i w:val="0"/>
+              <w:iCs/>
+              <w:sz w:val="22"/>
+            </w:rPr>
+            <m:t>β</m:t>
+          </m:r>
+          <m:r>
+            <m:rPr>
+              <m:nor/>
+              <m:sty m:val="p"/>
+            </m:rPr>
+            <w:rPr>
+              <w:rFonts w:hint="default" w:ascii="Times New Roman" w:hAnsi="Times New Roman" w:eastAsia="Times NR MT Pro Medium" w:cs="Times New Roman Italic"/>
+              <w:b w:val="0"/>
+              <w:i w:val="0"/>
+              <w:iCs/>
+              <w:sz w:val="22"/>
+            </w:rPr>
+            <m:t> (1−</m:t>
+          </m:r>
+          <m:r>
+            <m:rPr>
+              <m:nor/>
+              <m:sty m:val="p"/>
+            </m:rPr>
+            <w:rPr>
+              <w:rFonts w:hint="default" w:ascii="Times New Roman" w:hAnsi="Times New Roman" w:eastAsia="Times NR MT Pro Medium" w:cs="Times New Roman Italic"/>
+              <w:i w:val="0"/>
+              <w:iCs/>
+              <w:sz w:val="22"/>
+            </w:rPr>
+            <m:t>SSIM</m:t>
+          </m:r>
+          <m:r>
+            <m:rPr>
+              <m:nor/>
+              <m:sty m:val="p"/>
+            </m:rPr>
+            <w:rPr>
+              <w:rFonts w:hint="default" w:ascii="Times New Roman" w:hAnsi="Times New Roman" w:eastAsia="Times NR MT Pro Medium" w:cs="Times New Roman Italic"/>
+              <w:b w:val="0"/>
+              <w:i w:val="0"/>
+              <w:iCs/>
+              <w:sz w:val="22"/>
+            </w:rPr>
+            <m:t>) + </m:t>
+          </m:r>
+          <m:r>
+            <m:rPr>
+              <m:nor/>
+              <m:sty m:val="p"/>
+            </m:rPr>
+            <w:rPr>
+              <w:rFonts w:hint="default" w:ascii="Times New Roman" w:hAnsi="Times New Roman" w:eastAsia="Times NR MT Pro Medium" w:cs="Times New Roman Italic"/>
+              <w:i w:val="0"/>
+              <w:iCs/>
+              <w:sz w:val="22"/>
+            </w:rPr>
+            <m:t>η</m:t>
+          </m:r>
+          <m:r>
+            <m:rPr>
+              <m:nor/>
+              <m:sty m:val="p"/>
+            </m:rPr>
+            <w:rPr>
+              <w:rFonts w:hint="default" w:ascii="Times New Roman" w:hAnsi="Times New Roman" w:eastAsia="Times NR MT Pro Medium" w:cs="Times New Roman Italic"/>
+              <w:b w:val="0"/>
+              <w:i w:val="0"/>
+              <w:iCs/>
+              <w:sz w:val="22"/>
+            </w:rPr>
+            <m:t>  ⋅</m:t>
+          </m:r>
+          <m:r>
+            <m:rPr>
+              <m:nor/>
+              <m:sty m:val="p"/>
+            </m:rPr>
+            <w:rPr>
+              <w:rFonts w:hint="default" w:ascii="Times New Roman" w:hAnsi="Times New Roman" w:eastAsia="Times NR MT Pro Medium" w:cs="Times New Roman Italic"/>
+              <w:i w:val="0"/>
+              <w:iCs/>
+              <w:sz w:val="22"/>
+            </w:rPr>
+            <m:t>scalereg</m:t>
+          </m:r>
+          <m:r>
+            <m:rPr>
+              <m:nor/>
+              <m:sty m:val="p"/>
+            </m:rPr>
+            <w:rPr>
+              <w:rFonts w:hint="default" w:ascii="Times New Roman" w:hAnsi="Times New Roman" w:eastAsia="Times NR MT Pro Medium" w:cs="Times New Roman Italic"/>
+              <w:b w:val="0"/>
+              <w:i w:val="0"/>
+              <w:iCs/>
+              <w:sz w:val="22"/>
+            </w:rPr>
+            <m:t> + </m:t>
+          </m:r>
+          <m:r>
+            <m:rPr>
+              <m:nor/>
+              <m:sty m:val="p"/>
+            </m:rPr>
+            <w:rPr>
+              <w:rFonts w:hint="default" w:ascii="Times New Roman" w:hAnsi="Times New Roman" w:eastAsia="Times NR MT Pro Medium" w:cs="Times New Roman Italic"/>
+              <w:i w:val="0"/>
+              <w:iCs/>
+              <w:sz w:val="22"/>
+            </w:rPr>
+            <m:t>λ</m:t>
+          </m:r>
+          <m:r>
+            <m:rPr>
+              <m:nor/>
+              <m:sty m:val="p"/>
+            </m:rPr>
+            <w:rPr>
+              <w:rFonts w:hint="default" w:ascii="Times New Roman" w:hAnsi="Times New Roman" w:eastAsia="Times NR MT Pro Medium" w:cs="Times New Roman Italic"/>
+              <w:b w:val="0"/>
+              <w:i w:val="0"/>
+              <w:iCs/>
+              <w:sz w:val="22"/>
+            </w:rPr>
+            <m:t> </m:t>
+          </m:r>
+          <m:f>
+            <m:fPr>
+              <m:ctrlPr>
+                <w:rPr>
+                  <w:rFonts w:hint="default" w:ascii="DejaVu Math TeX Gyre" w:hAnsi="DejaVu Math TeX Gyre" w:eastAsia="Times NR MT Pro Medium" w:cs="Times New Roman Italic"/>
+                  <w:i w:val="0"/>
+                  <w:iCs/>
+                  <w:sz w:val="22"/>
+                </w:rPr>
+              </m:ctrlPr>
+            </m:fPr>
+            <m:num>
+              <m:r>
+                <m:rPr>
+                  <m:nor/>
+                  <m:sty m:val="p"/>
+                </m:rPr>
+                <w:rPr>
+                  <w:rFonts w:hint="default" w:ascii="Times New Roman" w:hAnsi="Times New Roman" w:eastAsia="Times NR MT Pro Medium" w:cs="Times New Roman Italic"/>
+                  <w:i w:val="0"/>
+                  <w:iCs/>
+                  <w:sz w:val="22"/>
+                </w:rPr>
+                <m:t>R</m:t>
+              </m:r>
+              <m:ctrlPr>
+                <w:rPr>
+                  <w:rFonts w:hint="default" w:ascii="DejaVu Math TeX Gyre" w:hAnsi="DejaVu Math TeX Gyre" w:eastAsia="Times NR MT Pro Medium" w:cs="Times New Roman Italic"/>
+                  <w:i w:val="0"/>
+                  <w:iCs/>
+                  <w:sz w:val="22"/>
+                </w:rPr>
+              </m:ctrlPr>
+            </m:num>
+            <m:den>
+              <m:r>
+                <m:rPr>
+                  <m:nor/>
+                  <m:sty m:val="p"/>
+                </m:rPr>
+                <w:rPr>
+                  <w:rFonts w:hint="default" w:ascii="Times New Roman" w:hAnsi="Times New Roman" w:eastAsia="Times NR MT Pro Medium" w:cs="Times New Roman Italic"/>
+                  <w:i w:val="0"/>
+                  <w:iCs/>
+                  <w:sz w:val="22"/>
+                </w:rPr>
+                <m:t>Nθ</m:t>
+              </m:r>
+              <m:ctrlPr>
+                <w:rPr>
+                  <w:rFonts w:hint="default" w:ascii="DejaVu Math TeX Gyre" w:hAnsi="DejaVu Math TeX Gyre" w:eastAsia="Times NR MT Pro Medium" w:cs="Times New Roman Italic"/>
+                  <w:i w:val="0"/>
+                  <w:iCs/>
+                  <w:sz w:val="22"/>
+                </w:rPr>
+              </m:ctrlPr>
+            </m:den>
+          </m:f>
+        </m:oMath>
+      </m:oMathPara>
+    </w:p>
+    <w:p>
+      <w:pPr>
+        <w:rPr>
+          <w:rFonts w:hint="default" w:hAnsi="DejaVu Math TeX Gyre" w:eastAsia="Times NR MT Pro Medium" w:cs="Times New Roman"/>
+          <w:i/>
+          <w:sz w:val="22"/>
+        </w:rPr>
+      </w:pPr>
+    </w:p>
+    <w:p>
+      <w:pPr>
+        <w:rPr>
+          <w:rFonts w:hint="default" w:hAnsi="Times New Roman" w:eastAsia="Times NR MT Pro Medium" w:cs="Times New Roman"/>
+          <w:i w:val="0"/>
+          <w:sz w:val="22"/>
+          <w:lang w:val="en-US" w:eastAsia="zh-CN"/>
+        </w:rPr>
+      </w:pPr>
+      <m:oMathPara>
+        <m:oMath>
+          <m:r>
+            <m:rPr>
+              <m:nor/>
+              <m:sty m:val="p"/>
             </m:rPr>
             <w:rPr>
               <w:rFonts w:hint="default" w:ascii="Times New Roman" w:hAnsi="Times New Roman" w:eastAsia="Times NR MT Pro Medium" w:cs="Times New Roman"/>
-              <w:i/>
+              <w:i w:val="0"/>
+              <w:iCs/>
+              <w:sz w:val="22"/>
+            </w:rPr>
+            <m:t>wit</m:t>
+          </m:r>
+          <m:r>
+            <m:rPr>
+              <m:nor/>
+              <m:sty m:val="p"/>
+            </m:rPr>
+            <w:rPr>
+              <w:rFonts w:hint="default" w:ascii="Times New Roman" w:hAnsi="Times New Roman" w:eastAsia="Times NR MT Pro Medium" w:cs="Times New Roman"/>
+              <w:b w:val="0"/>
+              <w:i w:val="0"/>
+              <w:iCs/>
+              <w:sz w:val="22"/>
+            </w:rPr>
+            <m:t>h </m:t>
+          </m:r>
+          <m:r>
+            <m:rPr>
+              <m:nor/>
+              <m:sty m:val="p"/>
+            </m:rPr>
+            <w:rPr>
+              <w:rFonts w:hint="default" w:ascii="Times New Roman" w:hAnsi="Times New Roman" w:eastAsia="Times NR MT Pro Medium" w:cs="Times New Roman"/>
+              <w:i w:val="0"/>
+              <w:iCs/>
               <w:sz w:val="22"/>
             </w:rPr>
             <m:t>β</m:t>
@@ -651,20 +1007,23 @@
               <w:rFonts w:hint="default" w:ascii="Times New Roman" w:hAnsi="Times New Roman" w:eastAsia="Times NR MT Pro Medium" w:cs="Times New Roman"/>
               <w:b w:val="0"/>
               <w:i w:val="0"/>
+              <w:iCs/>
               <w:sz w:val="22"/>
             </w:rPr>
-            <m:t>) </m:t>
+            <m:t>=0.2 </m:t>
           </m:r>
           <m:r>
             <m:rPr>
               <m:nor/>
+              <m:sty m:val="p"/>
             </m:rPr>
             <w:rPr>
               <w:rFonts w:hint="default" w:ascii="Times New Roman" w:hAnsi="Times New Roman" w:eastAsia="Times NR MT Pro Medium" w:cs="Times New Roman"/>
-              <w:i/>
+              <w:i w:val="0"/>
+              <w:iCs/>
               <w:sz w:val="22"/>
             </w:rPr>
-            <m:t>L</m:t>
+            <m:t>and</m:t>
           </m:r>
           <m:r>
             <m:rPr>
@@ -675,20 +1034,10 @@
               <w:rFonts w:hint="default" w:ascii="Times New Roman" w:hAnsi="Times New Roman" w:eastAsia="Times NR MT Pro Medium" w:cs="Times New Roman"/>
               <w:b w:val="0"/>
               <w:i w:val="0"/>
+              <w:iCs/>
               <w:sz w:val="22"/>
             </w:rPr>
-            <m:t>1 + </m:t>
-          </m:r>
-          <m:r>
-            <m:rPr>
-              <m:nor/>
-            </m:rPr>
-            <w:rPr>
-              <w:rFonts w:hint="default" w:ascii="Times New Roman" w:hAnsi="Times New Roman" w:eastAsia="Times NR MT Pro Medium" w:cs="Times New Roman"/>
-              <w:i/>
-              <w:sz w:val="22"/>
-            </w:rPr>
-            <m:t>β</m:t>
+            <m:t> </m:t>
           </m:r>
           <m:r>
             <m:rPr>
@@ -697,43 +1046,8 @@
             </m:rPr>
             <w:rPr>
               <w:rFonts w:hint="default" w:ascii="Times New Roman" w:hAnsi="Times New Roman" w:eastAsia="Times NR MT Pro Medium" w:cs="Times New Roman"/>
-              <w:b w:val="0"/>
               <w:i w:val="0"/>
-              <w:sz w:val="22"/>
-            </w:rPr>
-            <m:t> (1−</m:t>
-          </m:r>
-          <m:r>
-            <m:rPr>
-              <m:nor/>
-            </m:rPr>
-            <w:rPr>
-              <w:rFonts w:hint="default" w:ascii="Times New Roman" w:hAnsi="Times New Roman" w:eastAsia="Times NR MT Pro Medium" w:cs="Times New Roman"/>
-              <w:i/>
-              <w:sz w:val="22"/>
-            </w:rPr>
-            <m:t>SSIM</m:t>
-          </m:r>
-          <m:r>
-            <m:rPr>
-              <m:nor/>
-              <m:sty m:val="p"/>
-            </m:rPr>
-            <w:rPr>
-              <w:rFonts w:hint="default" w:ascii="Times New Roman" w:hAnsi="Times New Roman" w:eastAsia="Times NR MT Pro Medium" w:cs="Times New Roman"/>
-              <w:b w:val="0"/>
-              <w:i w:val="0"/>
-              <w:sz w:val="22"/>
-            </w:rPr>
-            <m:t>) + </m:t>
-          </m:r>
-          <m:r>
-            <m:rPr>
-              <m:nor/>
-            </m:rPr>
-            <w:rPr>
-              <w:rFonts w:hint="default" w:ascii="Times New Roman" w:hAnsi="Times New Roman" w:eastAsia="Times NR MT Pro Medium" w:cs="Times New Roman"/>
-              <w:i/>
+              <w:iCs/>
               <w:sz w:val="22"/>
             </w:rPr>
             <m:t>η</m:t>
@@ -747,221 +1061,7 @@
               <w:rFonts w:hint="default" w:ascii="Times New Roman" w:hAnsi="Times New Roman" w:eastAsia="Times NR MT Pro Medium" w:cs="Times New Roman"/>
               <w:b w:val="0"/>
               <w:i w:val="0"/>
-              <w:sz w:val="22"/>
-            </w:rPr>
-            <m:t>  ⋅</m:t>
-          </m:r>
-          <m:r>
-            <m:rPr>
-              <m:nor/>
-            </m:rPr>
-            <w:rPr>
-              <w:rFonts w:hint="default" w:ascii="Times New Roman" w:hAnsi="Times New Roman" w:eastAsia="Times NR MT Pro Medium" w:cs="Times New Roman"/>
-              <w:i/>
-              <w:sz w:val="22"/>
-            </w:rPr>
-            <m:t>scalereg</m:t>
-          </m:r>
-          <m:r>
-            <m:rPr>
-              <m:nor/>
-              <m:sty m:val="p"/>
-            </m:rPr>
-            <w:rPr>
-              <w:rFonts w:hint="default" w:ascii="Times New Roman" w:hAnsi="Times New Roman" w:eastAsia="Times NR MT Pro Medium" w:cs="Times New Roman"/>
-              <w:b w:val="0"/>
-              <w:i w:val="0"/>
-              <w:sz w:val="22"/>
-            </w:rPr>
-            <m:t> + </m:t>
-          </m:r>
-          <m:r>
-            <m:rPr>
-              <m:nor/>
-            </m:rPr>
-            <w:rPr>
-              <w:rFonts w:hint="default" w:ascii="Times New Roman" w:hAnsi="Times New Roman" w:eastAsia="Times NR MT Pro Medium" w:cs="Times New Roman"/>
-              <w:i/>
-              <w:sz w:val="22"/>
-            </w:rPr>
-            <m:t>λ</m:t>
-          </m:r>
-          <m:r>
-            <m:rPr>
-              <m:nor/>
-              <m:sty m:val="p"/>
-            </m:rPr>
-            <w:rPr>
-              <w:rFonts w:hint="default" w:ascii="Times New Roman" w:hAnsi="Times New Roman" w:eastAsia="Times NR MT Pro Medium" w:cs="Times New Roman"/>
-              <w:b w:val="0"/>
-              <w:i w:val="0"/>
-              <w:sz w:val="22"/>
-            </w:rPr>
-            <m:t> </m:t>
-          </m:r>
-          <m:f>
-            <m:fPr>
-              <m:ctrlPr>
-                <w:rPr>
-                  <w:rFonts w:hint="default" w:ascii="DejaVu Math TeX Gyre" w:hAnsi="DejaVu Math TeX Gyre" w:eastAsia="Times NR MT Pro Medium" w:cs="Times New Roman"/>
-                  <w:sz w:val="22"/>
-                </w:rPr>
-              </m:ctrlPr>
-            </m:fPr>
-            <m:num>
-              <m:r>
-                <m:rPr>
-                  <m:nor/>
-                </m:rPr>
-                <w:rPr>
-                  <w:rFonts w:hint="default" w:ascii="Times New Roman" w:hAnsi="Times New Roman" w:eastAsia="Times NR MT Pro Medium" w:cs="Times New Roman"/>
-                  <w:i/>
-                  <w:sz w:val="22"/>
-                </w:rPr>
-                <m:t>R</m:t>
-              </m:r>
-              <m:ctrlPr>
-                <w:rPr>
-                  <w:rFonts w:hint="default" w:ascii="DejaVu Math TeX Gyre" w:hAnsi="DejaVu Math TeX Gyre" w:eastAsia="Times NR MT Pro Medium" w:cs="Times New Roman"/>
-                  <w:sz w:val="22"/>
-                </w:rPr>
-              </m:ctrlPr>
-            </m:num>
-            <m:den>
-              <m:r>
-                <m:rPr>
-                  <m:nor/>
-                </m:rPr>
-                <w:rPr>
-                  <w:rFonts w:hint="default" w:ascii="Times New Roman" w:hAnsi="Times New Roman" w:eastAsia="Times NR MT Pro Medium" w:cs="Times New Roman"/>
-                  <w:i/>
-                  <w:sz w:val="22"/>
-                </w:rPr>
-                <m:t>Nθ</m:t>
-              </m:r>
-              <m:ctrlPr>
-                <w:rPr>
-                  <w:rFonts w:hint="default" w:ascii="DejaVu Math TeX Gyre" w:hAnsi="DejaVu Math TeX Gyre" w:eastAsia="Times NR MT Pro Medium" w:cs="Times New Roman"/>
-                  <w:sz w:val="22"/>
-                </w:rPr>
-              </m:ctrlPr>
-            </m:den>
-          </m:f>
-        </m:oMath>
-      </m:oMathPara>
-    </w:p>
-    <w:p>
-      <w:pPr>
-        <w:rPr>
-          <w:rFonts w:hint="default" w:hAnsi="DejaVu Math TeX Gyre" w:eastAsia="Times NR MT Pro Medium" w:cs="Times New Roman"/>
-          <w:i/>
-          <w:sz w:val="22"/>
-        </w:rPr>
-      </w:pPr>
-    </w:p>
-    <w:p>
-      <w:pPr>
-        <w:rPr>
-          <w:rFonts w:hint="default" w:hAnsi="Times New Roman" w:eastAsia="Times NR MT Pro Medium" w:cs="Times New Roman"/>
-          <w:i w:val="0"/>
-          <w:sz w:val="22"/>
-          <w:lang w:val="en-US" w:eastAsia="zh-CN"/>
-        </w:rPr>
-      </w:pPr>
-      <m:oMathPara>
-        <m:oMath>
-          <m:r>
-            <m:rPr>
-              <m:nor/>
-            </m:rPr>
-            <w:rPr>
-              <w:rFonts w:hint="default" w:ascii="Times New Roman" w:hAnsi="Times New Roman" w:eastAsia="Times NR MT Pro Medium" w:cs="Times New Roman"/>
-              <w:i/>
-              <w:sz w:val="22"/>
-            </w:rPr>
-            <m:t>wit</m:t>
-          </m:r>
-          <m:r>
-            <m:rPr>
-              <m:nor/>
-              <m:sty m:val="p"/>
-            </m:rPr>
-            <w:rPr>
-              <w:rFonts w:hint="default" w:ascii="Times New Roman" w:hAnsi="Times New Roman" w:eastAsia="Times NR MT Pro Medium" w:cs="Times New Roman"/>
-              <w:b w:val="0"/>
-              <w:i w:val="0"/>
-              <w:sz w:val="22"/>
-            </w:rPr>
-            <m:t>h </m:t>
-          </m:r>
-          <m:r>
-            <m:rPr>
-              <m:nor/>
-            </m:rPr>
-            <w:rPr>
-              <w:rFonts w:hint="default" w:ascii="Times New Roman" w:hAnsi="Times New Roman" w:eastAsia="Times NR MT Pro Medium" w:cs="Times New Roman"/>
-              <w:i/>
-              <w:sz w:val="22"/>
-            </w:rPr>
-            <m:t>β</m:t>
-          </m:r>
-          <m:r>
-            <m:rPr>
-              <m:nor/>
-              <m:sty m:val="p"/>
-            </m:rPr>
-            <w:rPr>
-              <w:rFonts w:hint="default" w:ascii="Times New Roman" w:hAnsi="Times New Roman" w:eastAsia="Times NR MT Pro Medium" w:cs="Times New Roman"/>
-              <w:b w:val="0"/>
-              <w:i w:val="0"/>
-              <w:sz w:val="22"/>
-            </w:rPr>
-            <m:t>=0.2 </m:t>
-          </m:r>
-          <m:r>
-            <m:rPr>
-              <m:nor/>
-            </m:rPr>
-            <w:rPr>
-              <w:rFonts w:hint="default" w:ascii="Times New Roman" w:hAnsi="Times New Roman" w:eastAsia="Times NR MT Pro Medium" w:cs="Times New Roman"/>
-              <w:i/>
-              <w:sz w:val="22"/>
-            </w:rPr>
-            <m:t>and</m:t>
-          </m:r>
-          <m:r>
-            <m:rPr>
-              <m:nor/>
-              <m:sty m:val="p"/>
-            </m:rPr>
-            <w:rPr>
-              <w:rFonts w:hint="default" w:ascii="Times New Roman" w:hAnsi="Times New Roman" w:eastAsia="Times NR MT Pro Medium" w:cs="Times New Roman"/>
-              <w:b w:val="0"/>
-              <w:i w:val="0"/>
-              <w:sz w:val="22"/>
-            </w:rPr>
-            <m:t> </m:t>
-          </m:r>
-          <m:r>
-            <m:rPr>
-              <m:nor/>
-            </m:rPr>
-            <w:rPr>
-              <w:rFonts w:hint="default" w:ascii="Times New Roman" w:hAnsi="Times New Roman" w:eastAsia="Times NR MT Pro Medium" w:cs="Times New Roman"/>
-              <w:i/>
-              <w:sz w:val="22"/>
-            </w:rPr>
-            <m:t>η</m:t>
-          </m:r>
-          <m:r>
-            <m:rPr>
-              <m:nor/>
-              <m:sty m:val="p"/>
-            </m:rPr>
-            <w:rPr>
-              <w:rFonts w:hint="default" w:ascii="Times New Roman" w:hAnsi="Times New Roman" w:eastAsia="Times NR MT Pro Medium" w:cs="Times New Roman"/>
-              <w:b w:val="0"/>
-              <w:i w:val="0"/>
+              <w:iCs/>
               <w:sz w:val="22"/>
             </w:rPr>
             <m:t>=0.01</m:t>
@@ -2147,7 +2247,7 @@
           <w:sz w:val="24"/>
           <w:szCs w:val="24"/>
         </w:rPr>
-        <w:t xml:space="preserve">. I6 changes only the training objective; encode and decode still follow the I2 formula path, so no bitstream field is added. In recorded experiments, I6 contributes approximately </w:t>
+        <w:t xml:space="preserve">. RSS changes only the training objective; encode and decode still follow the FQ formula path, so no bitstream field is added. In recorded experiments, RSS contributes approximately </w:t>
       </w:r>
       <w:r>
         <w:rPr>
@@ -2671,10 +2771,18 @@
       </w:r>
     </w:p>
     <w:p>
-      <w:r>
-        <w:rPr>
-          <w:rFonts w:hint="eastAsia"/>
+      <w:pPr>
+        <w:rPr>
+          <w:rFonts w:hint="default" w:ascii="Times New Roman Regular" w:hAnsi="Times New Roman Regular" w:cs="Times New Roman Regular"/>
           <w:b w:val="0"/>
+          <w:bCs w:val="0"/>
+        </w:rPr>
+      </w:pPr>
+      <w:r>
+        <w:rPr>
+          <w:rFonts w:hint="default" w:ascii="Times New Roman Regular" w:hAnsi="Times New Roman Regular" w:cs="Times New Roman Regular"/>
+          <w:b w:val="0"/>
+          <w:bCs w:val="0"/>
           <w:i w:val="0"/>
           <w:lang w:eastAsia="zh-CN"/>
         </w:rPr>
@@ -2682,7 +2790,9 @@
       </w:r>
       <w:r>
         <w:rPr>
+          <w:rFonts w:hint="default" w:ascii="Times New Roman Regular" w:hAnsi="Times New Roman Regular" w:cs="Times New Roman Regular"/>
           <w:b w:val="0"/>
+          <w:bCs w:val="0"/>
           <w:i w:val="0"/>
         </w:rPr>
         <w:t xml:space="preserve">'s anchor mask provides a soft per-anchor score </w:t>
@@ -2690,10 +2800,14 @@
       <m:oMath>
         <m:r>
           <m:rPr>
+            <m:nor/>
             <m:sty m:val="p"/>
           </m:rPr>
           <w:rPr>
-            <w:rFonts w:ascii="DejaVu Math TeX Gyre" w:hAnsi="DejaVu Math TeX Gyre" w:cs="Times New Roman"/>
+            <w:rFonts w:hint="default" w:ascii="Times New Roman" w:hAnsi="Times New Roman" w:cs="Times New Roman Regular"/>
+            <w:b w:val="0"/>
+            <w:bCs w:val="0"/>
+            <w:i w:val="0"/>
             <w:kern w:val="2"/>
             <w:sz w:val="21"/>
             <w:szCs w:val="22"/>
@@ -2704,7 +2818,9 @@
       </m:oMath>
       <w:r>
         <w:rPr>
+          <w:rFonts w:hint="default" w:ascii="Times New Roman Regular" w:hAnsi="Times New Roman Regular" w:cs="Times New Roman Regular"/>
           <w:b w:val="0"/>
+          <w:bCs w:val="0"/>
           <w:i w:val="0"/>
         </w:rPr>
         <w:t xml:space="preserve">. SPA adds two training-only tensors, a binary hard mask z and a multiplier u, and every 100 iterations performs the ADMM update </w:t>
@@ -2716,8 +2832,9 @@
             <m:sty m:val="p"/>
           </m:rPr>
           <w:rPr>
-            <w:rFonts w:hint="default" w:ascii="Times New Roman" w:hAnsi="Times New Roman" w:cs="Times New Roman"/>
+            <w:rFonts w:hint="default" w:ascii="Times New Roman" w:hAnsi="Times New Roman" w:cs="Times New Roman Regular"/>
             <w:b w:val="0"/>
+            <w:bCs w:val="0"/>
             <w:i w:val="0"/>
             <w:sz w:val="21"/>
           </w:rPr>
@@ -2726,7 +2843,9 @@
       </m:oMath>
       <w:r>
         <w:rPr>
+          <w:rFonts w:hint="default" w:ascii="Times New Roman Regular" w:hAnsi="Times New Roman Regular" w:cs="Times New Roman Regular"/>
           <w:b w:val="0"/>
+          <w:bCs w:val="0"/>
           <w:i w:val="0"/>
         </w:rPr>
         <w:t xml:space="preserve">, </w:t>
@@ -2738,8 +2857,9 @@
             <m:sty m:val="p"/>
           </m:rPr>
           <w:rPr>
-            <w:rFonts w:hint="default" w:ascii="Times New Roman" w:hAnsi="Times New Roman" w:cs="Times New Roman"/>
+            <w:rFonts w:hint="default" w:ascii="Times New Roman" w:hAnsi="Times New Roman" w:cs="Times New Roman Regular"/>
             <w:b w:val="0"/>
+            <w:bCs w:val="0"/>
             <w:i w:val="0"/>
             <w:kern w:val="2"/>
             <w:sz w:val="21"/>
@@ -2751,7 +2871,9 @@
       </m:oMath>
       <w:r>
         <w:rPr>
+          <w:rFonts w:hint="default" w:ascii="Times New Roman Regular" w:hAnsi="Times New Roman Regular" w:cs="Times New Roman Regular"/>
           <w:b w:val="0"/>
+          <w:bCs w:val="0"/>
           <w:i w:val="0"/>
         </w:rPr>
         <w:t xml:space="preserve">. The budget is </w:t>
@@ -2763,8 +2885,9 @@
             <m:sty m:val="p"/>
           </m:rPr>
           <w:rPr>
-            <w:rFonts w:hint="default" w:ascii="Times New Roman" w:hAnsi="Times New Roman" w:cs="Times New Roman"/>
+            <w:rFonts w:hint="default" w:ascii="Times New Roman" w:hAnsi="Times New Roman" w:cs="Times New Roman Regular"/>
             <w:b w:val="0"/>
+            <w:bCs w:val="0"/>
             <w:i w:val="0"/>
           </w:rPr>
           <m:t>κ=round(max(</m:t>
@@ -2773,7 +2896,9 @@
           <m:sSubPr>
             <m:ctrlPr>
               <w:rPr>
-                <w:rFonts w:hint="default" w:ascii="DejaVu Math TeX Gyre" w:hAnsi="DejaVu Math TeX Gyre" w:cs="Times New Roman"/>
+                <w:rFonts w:hint="default" w:ascii="DejaVu Math TeX Gyre" w:hAnsi="DejaVu Math TeX Gyre" w:cs="Times New Roman Regular"/>
+                <w:b w:val="0"/>
+                <w:bCs w:val="0"/>
                 <w:i w:val="0"/>
               </w:rPr>
             </m:ctrlPr>
@@ -2785,15 +2910,18 @@
                 <m:sty m:val="p"/>
               </m:rPr>
               <w:rPr>
-                <w:rFonts w:hint="default" w:ascii="Times New Roman" w:hAnsi="Times New Roman" w:cs="Times New Roman"/>
+                <w:rFonts w:hint="default" w:ascii="Times New Roman" w:hAnsi="Times New Roman" w:cs="Times New Roman Regular"/>
                 <w:b w:val="0"/>
+                <w:bCs w:val="0"/>
                 <w:i w:val="0"/>
               </w:rPr>
               <m:t>N</m:t>
             </m:r>
             <m:ctrlPr>
               <w:rPr>
-                <w:rFonts w:hint="default" w:ascii="DejaVu Math TeX Gyre" w:hAnsi="DejaVu Math TeX Gyre" w:cs="Times New Roman"/>
+                <w:rFonts w:hint="default" w:ascii="DejaVu Math TeX Gyre" w:hAnsi="DejaVu Math TeX Gyre" w:cs="Times New Roman Regular"/>
+                <w:b w:val="0"/>
+                <w:bCs w:val="0"/>
                 <w:i w:val="0"/>
               </w:rPr>
             </m:ctrlPr>
@@ -2805,8 +2933,9 @@
                 <m:sty m:val="p"/>
               </m:rPr>
               <w:rPr>
-                <w:rFonts w:hint="default" w:ascii="Times New Roman" w:hAnsi="Times New Roman" w:cs="Times New Roman"/>
+                <w:rFonts w:hint="default" w:ascii="Times New Roman" w:hAnsi="Times New Roman" w:cs="Times New Roman Regular"/>
                 <w:b w:val="0"/>
+                <w:bCs w:val="0"/>
                 <w:i w:val="0"/>
               </w:rPr>
               <m:t>r</m:t>
@@ -2817,8 +2946,9 @@
                 <m:sty m:val="p"/>
               </m:rPr>
               <w:rPr>
-                <w:rFonts w:hint="default" w:ascii="Times New Roman" w:hAnsi="Times New Roman" w:cs="Times New Roman"/>
+                <w:rFonts w:hint="default" w:ascii="Times New Roman" w:hAnsi="Times New Roman" w:cs="Times New Roman Regular"/>
                 <w:b w:val="0"/>
+                <w:bCs w:val="0"/>
                 <w:i w:val="0"/>
                 <w:lang w:val="en-US" w:eastAsia="zh-CN"/>
               </w:rPr>
@@ -2826,7 +2956,9 @@
             </m:r>
             <m:ctrlPr>
               <w:rPr>
-                <w:rFonts w:hint="default" w:ascii="DejaVu Math TeX Gyre" w:hAnsi="DejaVu Math TeX Gyre" w:cs="Times New Roman"/>
+                <w:rFonts w:hint="default" w:ascii="DejaVu Math TeX Gyre" w:hAnsi="DejaVu Math TeX Gyre" w:cs="Times New Roman Regular"/>
+                <w:b w:val="0"/>
+                <w:bCs w:val="0"/>
                 <w:i w:val="0"/>
               </w:rPr>
             </m:ctrlPr>
@@ -2838,8 +2970,9 @@
             <m:sty m:val="p"/>
           </m:rPr>
           <w:rPr>
-            <w:rFonts w:hint="default" w:ascii="Times New Roman" w:hAnsi="Times New Roman" w:cs="Times New Roman"/>
+            <w:rFonts w:hint="default" w:ascii="Times New Roman" w:hAnsi="Times New Roman" w:cs="Times New Roman Regular"/>
             <w:b w:val="0"/>
+            <w:bCs w:val="0"/>
             <w:i w:val="0"/>
           </w:rPr>
           <m:t>)∗rati</m:t>
@@ -2848,7 +2981,9 @@
           <m:sSubPr>
             <m:ctrlPr>
               <w:rPr>
-                <w:rFonts w:hint="default" w:ascii="DejaVu Math TeX Gyre" w:hAnsi="DejaVu Math TeX Gyre" w:cs="Times New Roman"/>
+                <w:rFonts w:hint="default" w:ascii="DejaVu Math TeX Gyre" w:hAnsi="DejaVu Math TeX Gyre" w:cs="Times New Roman Regular"/>
+                <w:b w:val="0"/>
+                <w:bCs w:val="0"/>
                 <w:i w:val="0"/>
               </w:rPr>
             </m:ctrlPr>
@@ -2860,15 +2995,18 @@
                 <m:sty m:val="p"/>
               </m:rPr>
               <w:rPr>
-                <w:rFonts w:hint="default" w:ascii="Times New Roman" w:hAnsi="Times New Roman" w:cs="Times New Roman"/>
+                <w:rFonts w:hint="default" w:ascii="Times New Roman" w:hAnsi="Times New Roman" w:cs="Times New Roman Regular"/>
                 <w:b w:val="0"/>
+                <w:bCs w:val="0"/>
                 <w:i w:val="0"/>
               </w:rPr>
               <m:t>o</m:t>
             </m:r>
             <m:ctrlPr>
               <w:rPr>
-                <w:rFonts w:hint="default" w:ascii="DejaVu Math TeX Gyre" w:hAnsi="DejaVu Math TeX Gyre" w:cs="Times New Roman"/>
+                <w:rFonts w:hint="default" w:ascii="DejaVu Math TeX Gyre" w:hAnsi="DejaVu Math TeX Gyre" w:cs="Times New Roman Regular"/>
+                <w:b w:val="0"/>
+                <w:bCs w:val="0"/>
                 <w:i w:val="0"/>
               </w:rPr>
             </m:ctrlPr>
@@ -2880,15 +3018,18 @@
                 <m:sty m:val="p"/>
               </m:rPr>
               <w:rPr>
-                <w:rFonts w:hint="default" w:ascii="Times New Roman" w:hAnsi="Times New Roman" w:cs="Times New Roman"/>
+                <w:rFonts w:hint="default" w:ascii="Times New Roman" w:hAnsi="Times New Roman" w:cs="Times New Roman Regular"/>
                 <w:b w:val="0"/>
+                <w:bCs w:val="0"/>
                 <w:i w:val="0"/>
               </w:rPr>
               <m:t>t</m:t>
             </m:r>
             <m:ctrlPr>
               <w:rPr>
-                <w:rFonts w:hint="default" w:ascii="DejaVu Math TeX Gyre" w:hAnsi="DejaVu Math TeX Gyre" w:cs="Times New Roman"/>
+                <w:rFonts w:hint="default" w:ascii="DejaVu Math TeX Gyre" w:hAnsi="DejaVu Math TeX Gyre" w:cs="Times New Roman Regular"/>
+                <w:b w:val="0"/>
+                <w:bCs w:val="0"/>
                 <w:i w:val="0"/>
               </w:rPr>
             </m:ctrlPr>
@@ -2900,8 +3041,9 @@
             <m:sty m:val="p"/>
           </m:rPr>
           <w:rPr>
-            <w:rFonts w:hint="default" w:ascii="Times New Roman" w:hAnsi="Times New Roman" w:cs="Times New Roman"/>
+            <w:rFonts w:hint="default" w:ascii="Times New Roman" w:hAnsi="Times New Roman" w:cs="Times New Roman Regular"/>
             <w:b w:val="0"/>
+            <w:bCs w:val="0"/>
             <w:i w:val="0"/>
           </w:rPr>
           <m:t>)</m:t>
@@ -2909,7 +3051,9 @@
       </m:oMath>
       <w:r>
         <w:rPr>
-          <w:rFonts w:hint="eastAsia" w:hAnsi="DejaVu Math TeX Gyre"/>
+          <w:rFonts w:hint="default" w:ascii="Times New Roman Regular" w:hAnsi="Times New Roman Regular" w:cs="Times New Roman Regular"/>
+          <w:b w:val="0"/>
+          <w:bCs w:val="0"/>
           <w:i w:val="0"/>
           <w:lang w:val="en-US" w:eastAsia="zh-CN"/>
         </w:rPr>
@@ -2917,7 +3061,9 @@
       </w:r>
       <w:r>
         <w:rPr>
+          <w:rFonts w:hint="default" w:ascii="Times New Roman Regular" w:hAnsi="Times New Roman Regular" w:cs="Times New Roman Regular"/>
           <w:b w:val="0"/>
+          <w:bCs w:val="0"/>
           <w:i w:val="0"/>
         </w:rPr>
         <w:t xml:space="preserve">with </w:t>
@@ -2929,8 +3075,9 @@
             <m:sty m:val="p"/>
           </m:rPr>
           <w:rPr>
-            <w:rFonts w:hint="default" w:ascii="Times New Roman" w:hAnsi="Times New Roman" w:cs="Times New Roman"/>
+            <w:rFonts w:hint="default" w:ascii="Times New Roman" w:hAnsi="Times New Roman" w:cs="Times New Roman Regular"/>
             <w:b w:val="0"/>
+            <w:bCs w:val="0"/>
             <w:i w:val="0"/>
             <w:sz w:val="21"/>
           </w:rPr>
@@ -2940,7 +3087,9 @@
           <m:sSubPr>
             <m:ctrlPr>
               <w:rPr>
-                <w:rFonts w:hint="default" w:ascii="DejaVu Math TeX Gyre" w:hAnsi="DejaVu Math TeX Gyre" w:cs="Times New Roman"/>
+                <w:rFonts w:hint="default" w:ascii="DejaVu Math TeX Gyre" w:hAnsi="DejaVu Math TeX Gyre" w:cs="Times New Roman Regular"/>
+                <w:b w:val="0"/>
+                <w:bCs w:val="0"/>
                 <w:i w:val="0"/>
                 <w:sz w:val="21"/>
               </w:rPr>
@@ -2953,8 +3102,9 @@
                 <m:sty m:val="p"/>
               </m:rPr>
               <w:rPr>
-                <w:rFonts w:hint="default" w:ascii="Times New Roman" w:hAnsi="Times New Roman" w:cs="Times New Roman"/>
+                <w:rFonts w:hint="default" w:ascii="Times New Roman" w:hAnsi="Times New Roman" w:cs="Times New Roman Regular"/>
                 <w:b w:val="0"/>
+                <w:bCs w:val="0"/>
                 <w:i w:val="0"/>
                 <w:sz w:val="21"/>
               </w:rPr>
@@ -2962,7 +3112,9 @@
             </m:r>
             <m:ctrlPr>
               <w:rPr>
-                <w:rFonts w:hint="default" w:ascii="DejaVu Math TeX Gyre" w:hAnsi="DejaVu Math TeX Gyre" w:cs="Times New Roman"/>
+                <w:rFonts w:hint="default" w:ascii="DejaVu Math TeX Gyre" w:hAnsi="DejaVu Math TeX Gyre" w:cs="Times New Roman Regular"/>
+                <w:b w:val="0"/>
+                <w:bCs w:val="0"/>
                 <w:i w:val="0"/>
                 <w:sz w:val="21"/>
               </w:rPr>
@@ -2975,8 +3127,9 @@
                 <m:sty m:val="p"/>
               </m:rPr>
               <w:rPr>
-                <w:rFonts w:hint="default" w:ascii="Times New Roman" w:hAnsi="Times New Roman" w:cs="Times New Roman"/>
+                <w:rFonts w:hint="default" w:ascii="Times New Roman" w:hAnsi="Times New Roman" w:cs="Times New Roman Regular"/>
                 <w:b w:val="0"/>
+                <w:bCs w:val="0"/>
                 <w:i w:val="0"/>
                 <w:sz w:val="21"/>
               </w:rPr>
@@ -2984,7 +3137,9 @@
             </m:r>
             <m:ctrlPr>
               <w:rPr>
-                <w:rFonts w:hint="default" w:ascii="DejaVu Math TeX Gyre" w:hAnsi="DejaVu Math TeX Gyre" w:cs="Times New Roman"/>
+                <w:rFonts w:hint="default" w:ascii="DejaVu Math TeX Gyre" w:hAnsi="DejaVu Math TeX Gyre" w:cs="Times New Roman Regular"/>
+                <w:b w:val="0"/>
+                <w:bCs w:val="0"/>
                 <w:i w:val="0"/>
                 <w:sz w:val="21"/>
               </w:rPr>
@@ -2994,7 +3149,9 @@
       </m:oMath>
       <w:r>
         <w:rPr>
+          <w:rFonts w:hint="default" w:ascii="Times New Roman Regular" w:hAnsi="Times New Roman Regular" w:cs="Times New Roman Regular"/>
           <w:b w:val="0"/>
+          <w:bCs w:val="0"/>
           <w:i w:val="0"/>
         </w:rPr>
         <w:t xml:space="preserve"> ramping linearly from 1.0 to the target ratio (e.g., 0.5) between the growth start and update_until; anchoring the budget to the maximum anchor count observed prevents the geometric collapse of a </w:t>
@@ -3005,7 +3162,9 @@
             <m:nor/>
           </m:rPr>
           <w:rPr>
-            <w:rFonts w:hint="default" w:ascii="Times New Roman" w:hAnsi="Times New Roman" w:cs="Times New Roman"/>
+            <w:rFonts w:hint="default" w:ascii="Times New Roman" w:hAnsi="Times New Roman" w:cs="Times New Roman Regular"/>
+            <w:b w:val="0"/>
+            <w:bCs w:val="0"/>
             <w:i/>
             <w:sz w:val="21"/>
           </w:rPr>
@@ -3017,8 +3176,9 @@
             <m:sty m:val="p"/>
           </m:rPr>
           <w:rPr>
-            <w:rFonts w:hint="default" w:ascii="Times New Roman" w:hAnsi="Times New Roman" w:cs="Times New Roman"/>
+            <w:rFonts w:hint="default" w:ascii="Times New Roman" w:hAnsi="Times New Roman" w:cs="Times New Roman Regular"/>
             <w:b w:val="0"/>
+            <w:bCs w:val="0"/>
             <w:i w:val="0"/>
             <w:sz w:val="21"/>
           </w:rPr>
@@ -3028,7 +3188,9 @@
           <m:sSubPr>
             <m:ctrlPr>
               <w:rPr>
-                <w:rFonts w:hint="default" w:ascii="DejaVu Math TeX Gyre" w:hAnsi="DejaVu Math TeX Gyre" w:cs="Times New Roman"/>
+                <w:rFonts w:hint="default" w:ascii="DejaVu Math TeX Gyre" w:hAnsi="DejaVu Math TeX Gyre" w:cs="Times New Roman Regular"/>
+                <w:b w:val="0"/>
+                <w:bCs w:val="0"/>
                 <w:sz w:val="21"/>
               </w:rPr>
             </m:ctrlPr>
@@ -3039,7 +3201,9 @@
                 <m:nor/>
               </m:rPr>
               <w:rPr>
-                <w:rFonts w:hint="default" w:ascii="Times New Roman" w:hAnsi="Times New Roman" w:cs="Times New Roman"/>
+                <w:rFonts w:hint="default" w:ascii="Times New Roman" w:hAnsi="Times New Roman" w:cs="Times New Roman Regular"/>
+                <w:b w:val="0"/>
+                <w:bCs w:val="0"/>
                 <w:i/>
                 <w:sz w:val="21"/>
               </w:rPr>
@@ -3047,7 +3211,9 @@
             </m:r>
             <m:ctrlPr>
               <w:rPr>
-                <w:rFonts w:hint="default" w:ascii="DejaVu Math TeX Gyre" w:hAnsi="DejaVu Math TeX Gyre" w:cs="Times New Roman"/>
+                <w:rFonts w:hint="default" w:ascii="DejaVu Math TeX Gyre" w:hAnsi="DejaVu Math TeX Gyre" w:cs="Times New Roman Regular"/>
+                <w:b w:val="0"/>
+                <w:bCs w:val="0"/>
                 <w:sz w:val="21"/>
               </w:rPr>
             </m:ctrlPr>
@@ -3058,7 +3224,9 @@
                 <m:nor/>
               </m:rPr>
               <w:rPr>
-                <w:rFonts w:hint="default" w:ascii="Times New Roman" w:hAnsi="Times New Roman" w:cs="Times New Roman"/>
+                <w:rFonts w:hint="default" w:ascii="Times New Roman" w:hAnsi="Times New Roman" w:cs="Times New Roman Regular"/>
+                <w:b w:val="0"/>
+                <w:bCs w:val="0"/>
                 <w:i/>
                 <w:sz w:val="21"/>
               </w:rPr>
@@ -3066,7 +3234,9 @@
             </m:r>
             <m:ctrlPr>
               <w:rPr>
-                <w:rFonts w:hint="default" w:ascii="DejaVu Math TeX Gyre" w:hAnsi="DejaVu Math TeX Gyre" w:cs="Times New Roman"/>
+                <w:rFonts w:hint="default" w:ascii="DejaVu Math TeX Gyre" w:hAnsi="DejaVu Math TeX Gyre" w:cs="Times New Roman Regular"/>
+                <w:b w:val="0"/>
+                <w:bCs w:val="0"/>
                 <w:sz w:val="21"/>
               </w:rPr>
             </m:ctrlPr>
@@ -3075,7 +3245,9 @@
       </m:oMath>
       <w:r>
         <w:rPr>
-          <w:rFonts w:hint="eastAsia" w:hAnsi="DejaVu Math TeX Gyre" w:cs="Times New Roman"/>
+          <w:rFonts w:hint="default" w:ascii="Times New Roman Regular" w:hAnsi="Times New Roman Regular" w:cs="Times New Roman Regular"/>
+          <w:b w:val="0"/>
+          <w:bCs w:val="0"/>
           <w:i w:val="0"/>
           <w:sz w:val="21"/>
           <w:lang w:val="en-US" w:eastAsia="zh-CN"/>
@@ -3084,7 +3256,9 @@
       </w:r>
       <w:r>
         <w:rPr>
+          <w:rFonts w:hint="default" w:ascii="Times New Roman Regular" w:hAnsi="Times New Roman Regular" w:cs="Times New Roman Regular"/>
           <w:b w:val="0"/>
+          <w:bCs w:val="0"/>
           <w:i w:val="0"/>
         </w:rPr>
         <w:t>schedule. The augmented loss term</w:t>
@@ -3096,8 +3270,9 @@
             <m:sty m:val="p"/>
           </m:rPr>
           <w:rPr>
-            <w:rFonts w:hint="default" w:ascii="Times New Roman" w:hAnsi="Times New Roman" w:cs="Times New Roman"/>
+            <w:rFonts w:hint="default" w:ascii="Times New Roman" w:hAnsi="Times New Roman" w:cs="Times New Roman Regular"/>
             <w:b w:val="0"/>
+            <w:bCs w:val="0"/>
             <w:i w:val="0"/>
             <w:kern w:val="2"/>
             <w:sz w:val="21"/>
@@ -3111,16 +3286,10 @@
         <w:rPr>
           <w:rFonts w:hint="default" w:ascii="Times New Roman Regular" w:hAnsi="Times New Roman Regular" w:cs="Times New Roman Regular"/>
           <w:b w:val="0"/>
+          <w:bCs w:val="0"/>
           <w:i w:val="0"/>
         </w:rPr>
-        <w:t xml:space="preserve">（ρ=1e-3） </w:t>
-      </w:r>
-      <w:r>
-        <w:rPr>
-          <w:b w:val="0"/>
-          <w:i w:val="0"/>
-        </w:rPr>
-        <w:t>is added to the training loss, and z replaces the heuristic opacity pruning while SPA is enabled. SPA state is never written to the bitstream.</w:t>
+        <w:t>（ρ=1e-3） is added to the training loss, and z replaces the heuristic opacity pruning while SPA is enabled. SPA state is never written to the bitstream.</w:t>
       </w:r>
     </w:p>
     <w:p>
@@ -3227,7 +3396,7 @@
           <w:szCs w:val="28"/>
           <w:lang w:val="en-US" w:eastAsia="zh-CN" w:bidi="ar-SA"/>
         </w:rPr>
-        <w:t>Training protocol. The recommended configuration is I2 + I6, feature dimension 50, complexity hidden 32, voxel size 0.001, 10 offsets, appearance dimension 0, and 110,000 iterations with anchor growth stopped after 45,000. We report λ in {0.001, 0.002, 0.004}. Every result below is the decoded-view metric of the actual bitstream; the quantized column additionally applies the mixed-precision MLP quantization of Section 2.4.</w:t>
+        <w:t>Training protocol. The recommended configuration is FQ + RSS, feature dimension 50, complexity hidden 32, voxel size 0.001, 10 offsets, appearance dimension 0, and 110,000 iterations with anchor growth stopped after 45,000. We report λ in {0.001, 0.002, 0.004}. Every result below is the decoded-view metric of the actual bitstream; the quantized column additionally applies the mixed-precision MLP quantization of Section 2.4.</w:t>
       </w:r>
     </w:p>
     <w:p>
@@ -9094,7 +9263,7 @@
           <w:szCs w:val="24"/>
           <w:lang w:val="en-US" w:eastAsia="zh-CN" w:bidi="ar"/>
         </w:rPr>
-        <w:t>Table 2 reports the cross-method comparison on Deep Blending. To make the comparison unambiguous, DCCA-GS is shown at two operating points: the high-quality point (I2 + I6 + MLP quantization, without SPA) reaches 30.73 dB PSNR, 0.913 SSIM, and 4.22 MB; the low-bitrate SPA point reaches 29.90 dB PSNR and 0.96 MB. Compared with HAC++ highrate (30.93 dB, 4.56 MB), the high-quality point achieves nearly identical quality while reducing the size by about 7.5%; compared with ContextGS highrate (30.93 dB, 5.67 MB), it is about 25.5% smaller at comparable quality. The low-bitrate SPA point extends the operating range to sub-1 MiB while remaining competitive with low-bitrate baselines. Note that Table 3 in Section 3.3 reports DCCA-GS’s own λ sweep on Deep Blending, whereas Table 2 is the cross-method comparison; the two tables should be read together but serve different purposes.</w:t>
+        <w:t>Table 2 reports the cross-method comparison on Deep Blending. To make the comparison unambiguous, DCCA-GS is shown at two operating points: the high-quality point (FQ + RSS + MLP quantization, without SPA) reaches 30.73 dB PSNR, 0.913 SSIM, and 4.22 MB; the low-bitrate SPA point reaches 29.90 dB PSNR and 0.96 MB. Compared with HAC++ highrate (30.93 dB, 4.56 MB), the high-quality point achieves nearly identical quality while reducing the size by about 7.5%; compared with ContextGS highrate (30.93 dB, 5.67 MB), it is about 25.5% smaller at comparable quality. The low-bitrate SPA point extends the operating range to sub-1 MiB while remaining competitive with low-bitrate baselines. Note that Table 3 in Section 3.3 reports DCCA-GS’s own λ sweep on Deep Blending, whereas Table 2 is the cross-method comparison; the two tables should be read together but serve different purposes.</w:t>
       </w:r>
     </w:p>
     <w:p>
@@ -9174,7 +9343,7 @@
           <w:szCs w:val="24"/>
           <w:lang w:val="en-US" w:eastAsia="zh-CN" w:bidi="ar"/>
         </w:rPr>
-        <w:t xml:space="preserve"> Generalization study: comparison with state-of-the-art methods on Deep Blending. Sizes are decode-required payload in MiB. DCCA-GS is reported at both its high-quality operating point (I2+I6 + MLP quantization, without SPA) and low-bitrate operating point (I2+I6 + MLP quantization + SPA).</w:t>
+        <w:t xml:space="preserve"> Generalization study: comparison with state-of-the-art methods on Deep Blending. Sizes are decode-required payload in MiB. DCCA-GS is reported at both its high-quality operating point (FQ+RSS + MLP quantization, without SPA) and low-bitrate operating point (FQ+RSS + MLP quantization + SPA).</w:t>
       </w:r>
     </w:p>
     <w:tbl>
@@ -14567,7 +14736,7 @@
           <w:szCs w:val="24"/>
           <w:lang w:val="en-US" w:eastAsia="zh-CN"/>
         </w:rPr>
-        <w:t>To directly validate the contribution of each proposed component, we ablate SPA, I2, and I6 on Deep Blending playroom at 110k iterations and λ = 0.002. All variants in Table 4 use the float32 codec (without MLP quantization) and are evaluated on decoded bitstreams.</w:t>
+        <w:t>To directly validate the contribution of each proposed component, we ablate SPA, FQ, and RSS on Deep Blending playroom at 110k iterations and λ = 0.002. All variants in Table 4 use the float32 codec (without MLP quantization) and are evaluated on decoded bitstreams.</w:t>
       </w:r>
     </w:p>
     <w:p>
@@ -14624,7 +14793,7 @@
           <w:szCs w:val="24"/>
           <w:lang w:val="en-US" w:eastAsia="zh-CN" w:bidi="ar"/>
         </w:rPr>
-        <w:t xml:space="preserve"> Ablation of SPA, I2, and I6 on Deep Blending playroom (110k, λ = 0.002). ΔPSNR and ΔSize are relative to the full SPA model with I2 and I6 enabled.</w:t>
+        <w:t xml:space="preserve"> Ablation of SPA, FQ, and RSS on Deep Blending playroom (110k, λ = 0.002). ΔPSNR and ΔSize are relative to the full SPA model with FQ and RSS enabled.</w:t>
       </w:r>
     </w:p>
     <w:tbl>
@@ -15046,7 +15215,7 @@
                 <w:bdr w:val="none" w:color="auto" w:sz="0" w:space="0"/>
                 <w:lang w:val="en-US" w:eastAsia="zh-CN" w:bidi="ar"/>
               </w:rPr>
-              <w:t>Full  (I2+I6+SPA)</w:t>
+              <w:t>Full  (FQ+RSS+SPA)</w:t>
             </w:r>
           </w:p>
         </w:tc>
@@ -15387,7 +15556,7 @@
                 <w:bdr w:val="none" w:color="auto" w:sz="0" w:space="0"/>
                 <w:lang w:val="en-US" w:eastAsia="zh-CN" w:bidi="ar"/>
               </w:rPr>
-              <w:t>No SPA + I2 (w/o I6)</w:t>
+              <w:t>No SPA + FQ (w/o RSS)</w:t>
             </w:r>
           </w:p>
         </w:tc>
@@ -15728,7 +15897,7 @@
                 <w:bdr w:val="none" w:color="auto" w:sz="0" w:space="0"/>
                 <w:lang w:val="en-US" w:eastAsia="zh-CN" w:bidi="ar"/>
               </w:rPr>
-              <w:t>No SPA (w/o I2/I6)</w:t>
+              <w:t>No SPA (w/o FQ/RSS)</w:t>
             </w:r>
           </w:p>
         </w:tc>
@@ -16069,7 +16238,7 @@
                 <w:bdr w:val="none" w:color="auto" w:sz="0" w:space="0"/>
                 <w:lang w:val="en-US" w:eastAsia="zh-CN" w:bidi="ar"/>
               </w:rPr>
-              <w:t>No SPA (I2+I6)</w:t>
+              <w:t>No SPA (FQ+RSS)</w:t>
             </w:r>
           </w:p>
         </w:tc>
@@ -16410,7 +16579,7 @@
                 <w:bdr w:val="none" w:color="auto" w:sz="0" w:space="0"/>
                 <w:lang w:val="en-US" w:eastAsia="zh-CN" w:bidi="ar"/>
               </w:rPr>
-              <w:t>SPA + I2 (w/o I6)</w:t>
+              <w:t>SPA + FQ (w/o RSS)</w:t>
             </w:r>
           </w:p>
         </w:tc>
@@ -16751,7 +16920,7 @@
                 <w:bdr w:val="none" w:color="auto" w:sz="0" w:space="0"/>
                 <w:lang w:val="en-US" w:eastAsia="zh-CN" w:bidi="ar"/>
               </w:rPr>
-              <w:t>SPA only (w/o I2/I6)</w:t>
+              <w:t>SPA only (w/o FQ/RSS)</w:t>
             </w:r>
           </w:p>
         </w:tc>
@@ -17080,7 +17249,7 @@
           <w:szCs w:val="24"/>
           <w:lang w:val="en-US" w:eastAsia="zh-CN" w:bidi="ar"/>
         </w:rPr>
-        <w:t>Enabling SPA is the dominant rate-reduction factor: it reduces the decoded payload from approximately 4.38 MB to 1.13 MB (≈74%) at a cost of 0.84 dB PSNR, and this behavior is consistent across all I2/I6 configurations. Within the SPA regime, I6 remains clearly beneficial: the full model outperforms SPA without I6 by 0.42 dB PSNR, albeit at a modest rate increase of 0.15 MB. In the non-SPA regime, I6 also improves PSNR by 0.064 dB while slightly decreasing rate, confirming its positive contribution independent of SPA.</w:t>
+        <w:t>Enabling SPA is the dominant rate-reduction factor: it reduces the decoded payload from approximately 4.38 MB to 1.13 MB (≈74%) at a cost of 0.84 dB PSNR, and this behavior is consistent across all FQ/RSS configurations. Within the SPA regime, RSS remains clearly beneficial: the full model outperforms SPA without RSS by 0.42 dB PSNR, albeit at a modest rate increase of 0.15 MB. In the non-SPA regime, RSS also improves PSNR by 0.064 dB while slightly decreasing rate, confirming its positive contribution independent of SPA.</w:t>
       </w:r>
     </w:p>
     <w:p>
@@ -17109,7 +17278,7 @@
           <w:szCs w:val="24"/>
           <w:lang w:val="en-US" w:eastAsia="zh-CN" w:bidi="ar"/>
         </w:rPr>
-        <w:t>The effect of I2 is more nuanced and configuration-dependent. Without SPA, enabling the I2+I6 combination yields essentially no PSNR change (+0.002 dB) with a small rate reduction, indicating that I2 alone contributes little on this scene. With SPA, the full model is 0.13 dB better than the SPA-only baseline, but the SPA+I2 (w/o I6) variant is 0.29 dB worse than SPA-only, revealing a strong interaction between I2 and I6 in the low-rate regime. This suggests that I2 should be reported jointly with I6, and that isolated I2 conclusions should be avoided in the low-rate SPA operating point.</w:t>
+        <w:t>The effect of FQ is more nuanced and configuration-dependent. Without SPA, enabling the FQ+RSS combination yields essentially no PSNR change (+0.002 dB) with a small rate reduction, indicating that FQ alone contributes little on this scene. With SPA, the full model is 0.13 dB better than the SPA-only baseline, but the SPA+FQ (w/o RSS) variant is 0.29 dB worse than SPA-only, revealing a strong interaction between FQ and RSS in the low-rate regime. This suggests that FQ should be reported jointly with RSS, and that isolated FQ conclusions should be avoided in the low-rate SPA operating point.</w:t>
       </w:r>
     </w:p>
     <w:p>
@@ -19441,7 +19610,6 @@
           <w:lang w:val="en-US" w:eastAsia="zh-CN" w:bidi="ar"/>
         </w:rPr>
       </w:pPr>
-      <w:bookmarkStart w:id="9" w:name="_GoBack"/>
       <w:r>
         <w:rPr>
           <w:rFonts w:hint="default" w:ascii="Times New Roman" w:hAnsi="Times New Roman" w:eastAsia="宋体" w:cs="Times New Roman"/>
@@ -19453,7 +19621,6 @@
         <w:t>This contribution proposes DCCA-GS, a comprehensive compression framework for anchor-based 3D Gaussian Splatting. By introducing decoder-reproducible content-adaptive quantization, render-sensitivity supervision, mixed-precision MLP quantization, and training-side ADMM sparsity, DCCA-GS achieves significant bitrate savings while maintaining high rendering fidelity. Extensive experiments on UAV and indoor scenes validate that the proposed method provides a smooth rate-distortion trade-off, pushing the compression ratio up to 111× with minimal quality loss. Future work will explore integrating this framework into real-time streaming pipelines.</w:t>
       </w:r>
     </w:p>
-    <w:bookmarkEnd w:id="9"/>
     <w:p>
       <w:pPr>
         <w:pStyle w:val="2"/>
@@ -20968,8 +21135,8 @@
         </w:rPr>
         <w:t xml:space="preserve">Dear </w:t>
       </w:r>
+      <w:bookmarkStart w:id="4" w:name="Text8"/>
       <w:permStart w:id="2" w:edGrp="everyone"/>
-      <w:bookmarkStart w:id="4" w:name="Text8"/>
       <w:r>
         <w:rPr>
           <w:rFonts w:ascii="Times New Roman" w:hAnsi="Times New Roman"/>
@@ -21017,8 +21184,8 @@
         </w:rPr>
         <w:fldChar w:fldCharType="end"/>
       </w:r>
+      <w:bookmarkEnd w:id="4"/>
       <w:permEnd w:id="2"/>
-      <w:bookmarkEnd w:id="4"/>
       <w:r>
         <w:rPr>
           <w:rFonts w:ascii="Times New Roman" w:hAnsi="Times New Roman"/>

</xml_diff>